<commit_message>
update of T5 model
</commit_message>
<xml_diff>
--- a/Baseline Transfomer Model Output.docx
+++ b/Baseline Transfomer Model Output.docx
@@ -9,6 +9,11 @@
     </w:p>
     <w:p/>
     <w:p>
+      <w:pPr>
+        <w:rPr>
+          <w:rFonts w:hint="eastAsia"/>
+        </w:rPr>
+      </w:pPr>
       <w:r>
         <w:t xml:space="preserve">To demonstrate the effectiveness of our model performance, we identified a baseline from the paper </w:t>
       </w:r>
@@ -85,7 +90,13 @@
       </w:r>
       <w:proofErr w:type="gramEnd"/>
       <w:r>
-        <w:t xml:space="preserve"> ChemBERTa-v1, ChemBERTa-v2’s architecture is based on </w:t>
+        <w:t xml:space="preserve"> ChemBERTa-v1, </w:t>
+      </w:r>
+      <w:r>
+        <w:t xml:space="preserve">whose </w:t>
+      </w:r>
+      <w:r>
+        <w:t xml:space="preserve">architecture is based on </w:t>
       </w:r>
       <w:proofErr w:type="spellStart"/>
       <w:r>
@@ -2032,6 +2043,7 @@
   <w:style w:type="character" w:default="1" w:styleId="DefaultParagraphFont">
     <w:name w:val="Default Paragraph Font"/>
     <w:uiPriority w:val="1"/>
+    <w:semiHidden/>
     <w:unhideWhenUsed/>
   </w:style>
   <w:style w:type="table" w:default="1" w:styleId="TableNormal">

</xml_diff>